<commit_message>
feat(tcc): real AVM metrics, pipeline figure, honesty fixes
- Add eval_avm.py: reproducible Experiment A (5-split mean±std), neighborhood
  feature fit train-only (no leakage), baseline vs AVM, MAPE/RMSE/pinball/coverage
- Add gen_tcc_figura.py + embed pipeline diagram (Figure 1) in the monograph
- Fill Results chapter with real numbers (AVM MAPE 81.7% vs baseline 129.6%)
- Fix ITBI ground-truth tense across abstract/intro/method (ITBI=0 in current
  base, disclosed); calibrate conclusions to relative gain + architectural viability
- Expand references to 22 (NBR 6023) with inline citations

Co-Authored-By: Claude Opus 4.8 <noreply@anthropic.com>
</commit_message>
<xml_diff>
--- a/docs/TCC_modelo_negocio.docx
+++ b/docs/TCC_modelo_negocio.docx
@@ -281,7 +281,7 @@
     <w:p/>
     <w:p>
       <w:r>
-        <w:t>A decisão de aquisição de terrenos para empreendimentos de habitação popular do programa Minha Casa Minha Vida (MCMV) é tomada, em pequenas e médias incorporadoras, sob forte incerteza e com base em informação dispersa e em preços de anúncio, que divergem dos valores efetivamente transacionados. Este trabalho apresenta o MaríliaBot, uma plataforma de inteligência imobiliária que integra dados públicos imobiliários, urbanísticos e construtivos para apoiar a análise de viabilidade de terrenos em Marília-SP. Adotando a abordagem de estudo de caso aplicado à construtora BM3, o sistema coleta dados de múltiplas fontes públicas, estima o valor de mercado por meio de um modelo de avaliação automatizada (AVM) baseado em regressão por quantis (LightGBM), calibrado com transações reais de ITBI como verdade-fundamento, explica suas previsões com valores SHAP e simula a viabilidade econômico-financeira (VGV, TIR e payback) sob as faixas do MCMV. Os resultados, avaliados contra um baseline de preço médio por metro quadrado e reproduzidos em casos reais da BM3, indicam que a solução reduz a incerteza decisória e torna o processo auditável e reproduzível, a custo operacional marginal, demonstrando a aplicabilidade da Construção 4.0 fora dos grandes centros urbanos.</w:t>
+        <w:t>A decisão de aquisição de terrenos para empreendimentos de habitação popular do programa Minha Casa Minha Vida (MCMV) é tomada, em pequenas e médias incorporadoras, sob forte incerteza e com base em informação dispersa e em preços de anúncio, que divergem dos valores efetivamente transacionados. Este trabalho apresenta o MaríliaBot, uma plataforma de inteligência imobiliária que integra dados públicos imobiliários, urbanísticos e construtivos para apoiar a análise de viabilidade de terrenos em Marília-SP. Adotando a abordagem de estudo de caso aplicado à construtora BM3, o sistema coleta dados de múltiplas fontes públicas, estima o valor de mercado por meio de um modelo de avaliação automatizada (AVM) baseado em regressão por quantis (LightGBM), tendo as transações de ITBI como verdade-fundamento de projeto, explica suas previsões com valores SHAP e simula a viabilidade econômico-financeira (VGV, TIR e payback) sob as faixas do MCMV. Os resultados, avaliados contra um baseline de preço médio por metro quadrado, indicam que o AVM supera consistentemente o baseline e que a plataforma torna o processo de avaliação auditável e reproduzível, a custo operacional marginal, demonstrando a aplicabilidade da Construção 4.0 fora dos grandes centros urbanos, ainda que a precisão absoluta permaneça limitada pelo tamanho da amostra e pela indisponibilidade atual de transações.</w:t>
       </w:r>
     </w:p>
     <w:p>
@@ -315,7 +315,7 @@
     </w:p>
     <w:p>
       <w:r>
-        <w:t>In small and medium real estate developers, the decision to acquire land for affordable housing projects under the Minha Casa Minha Vida (MCMV) program is made under strong uncertainty, based on scattered information and on listing prices that diverge from actual transaction values. This work presents MaríliaBot, a real estate intelligence platform that integrates public real estate, urban and construction data to support land feasibility analysis in Marília, Brazil. Adopting a case study approach applied to the BM3 construction company, the system collects data from multiple public sources, estimates market value through an Automated Valuation Model (AVM) based on quantile regression (LightGBM), calibrated with real property transfer tax (ITBI) transactions as ground truth, explains its predictions using SHAP values, and simulates the economic and financial feasibility (gross sales value, IRR and payback) under the MCMV income brackets. The results, evaluated against a price-per-square-meter baseline and reproduced on real BM3 cases, indicate that the solution reduces decision uncertainty and makes the process auditable and reproducible at marginal operating cost, demonstrating the applicability of Construction 4.0 beyond major urban centers.</w:t>
+        <w:t>In small and medium real estate developers, the decision to acquire land for affordable housing projects under the Minha Casa Minha Vida (MCMV) program is made under strong uncertainty, based on scattered information and on listing prices that diverge from actual transaction values. This work presents MaríliaBot, a real estate intelligence platform that integrates public real estate, urban and construction data to support land feasibility analysis in Marília, Brazil. Adopting a case study approach applied to the BM3 construction company, the system collects data from multiple public sources, estimates market value through an Automated Valuation Model (AVM) based on quantile regression (LightGBM), designed to use property transfer tax (ITBI) transactions as ground truth, explains its predictions using SHAP values, and simulates the economic and financial feasibility (gross sales value, IRR and payback) under the MCMV income brackets. The results, evaluated against a price-per-square-meter baseline, indicate that the AVM consistently outperforms the baseline and that the platform makes the valuation process auditable and reproducible at marginal operating cost, demonstrating the applicability of Construction 4.0 beyond major urban centers.</w:t>
       </w:r>
     </w:p>
     <w:p>
@@ -410,7 +410,7 @@
         <w:ind w:firstLine="709"/>
       </w:pPr>
       <w:r>
-        <w:t>Dados oficiais confirmam a materialidade do risco. O Índice Nacional de Custo da Construção (INCC/FGV) acumulou, em períodos recentes, variações superiores à inflação geral, pressionando orçamentos previamente fechados. O Sistema Nacional de Pesquisa de Custos e Índices da Construção Civil (SINAPI), mantido por Caixa Econômica Federal e IBGE, evidencia diferenças expressivas de preço de insumos e serviços entre estados e municípios, o que inviabiliza generalizar estimativas. Para um incorporador de uma única cidade do interior, com capital de giro limitado, essa volatilidade não é abstração macroeconômica — é a diferença entre um empreendimento que fecha no azul e outro que trava capital.</w:t>
+        <w:t>Dados oficiais confirmam a materialidade do risco. O Índice Nacional de Custo da Construção (INCC/FGV) acumulou, em períodos recentes, variações superiores à inflação geral (FUNDAÇÃO GETULIO VARGAS, 2024), pressionando orçamentos previamente fechados. O Sistema Nacional de Pesquisa de Custos e Índices da Construção Civil (SINAPI), mantido por Caixa Econômica Federal e IBGE, evidencia diferenças expressivas de preço de insumos e serviços entre estados e municípios (CAIXA ECONÔMICA FEDERAL, 2024), o que inviabiliza generalizar estimativas. Para um incorporador de uma única cidade do interior, com capital de giro limitado, essa volatilidade não é abstração macroeconômica — é a diferença entre um empreendimento que fecha no azul e outro que trava capital.</w:t>
       </w:r>
     </w:p>
     <w:p>
@@ -450,7 +450,7 @@
         <w:ind w:firstLine="709"/>
       </w:pPr>
       <w:r>
-        <w:t>Três características diferenciam a proposta das soluções existentes. Primeiro, a coleta própria e off-market: em vez de comprar dados de terceiros, o sistema coleta diretamente de dezenas de fontes — portais imobiliários, mas também sinais que antecedem o mercado, como alvarás de construção e Estudos de Impacto de Vizinhança publicados no Diário Oficial Municipal. Segundo, a verdade-fundamento real: o modelo de avaliação é calibrado com transações de ITBI — preço registrado em cartório —, corrigindo o viés de sobrevivência de treinar uma IA em anúncios que talvez nunca tenham virado venda. Terceiro, o encadeamento da estimativa à decisão: o sistema vai da previsão de preço à estimativa de custo e à simulação de viabilidade, entregando um veredito explicável.</w:t>
+        <w:t>Três características diferenciam a proposta das soluções existentes. Primeiro, a coleta própria e off-market: em vez de comprar dados de terceiros, o sistema coleta diretamente de dezenas de fontes — portais imobiliários, mas também sinais que antecedem o mercado, como alvarás de construção e Estudos de Impacto de Vizinhança publicados no Diário Oficial Municipal. Segundo, a verdade-fundamento real: o modelo de avaliação é projetado para se calibrar com transações de ITBI — preço registrado em cartório —, corrigindo o viés de sobrevivência de treinar uma IA apenas em anúncios; registra-se que, na base atual, tais transações ainda não estão disponíveis (Seção 5.1), de modo que essa calibração é hoje uma característica de arquitetura, ainda não exercida. Terceiro, o encadeamento da estimativa à decisão: o sistema vai da previsão de preço à estimativa de custo e à simulação de viabilidade, entregando um veredito explicável.</w:t>
       </w:r>
     </w:p>
     <w:p>
@@ -561,7 +561,7 @@
         <w:ind w:firstLine="709"/>
       </w:pPr>
       <w:r>
-        <w:t>O conceito de Indústria 4.0 designa a quarta revolução industrial, caracterizada pela integração de sistemas ciberfísicos, Internet das Coisas, computação em nuvem, Big Data e Inteligência Artificial, com o objetivo de criar fábricas inteligentes capazes de automação avançada e decisão descentralizada. Setores como a manufatura adotaram esses paradigmas rapidamente; a construção civil, ao contrário, manteve-se historicamente lenta na digitalização, convivendo com produtividade estagnada e desperdício. A transição para a chamada Construção 4.0 propõe digitalizar o ciclo de vida completo do empreendimento, e é exatamente no espaço da decisão baseada em dados antes do canteiro que este trabalho se posiciona.</w:t>
+        <w:t>O conceito de Indústria 4.0 designa a quarta revolução industrial, caracterizada pela integração de sistemas ciberfísicos, Internet das Coisas, computação em nuvem, Big Data e Inteligência Artificial, com o objetivo de criar fábricas inteligentes capazes de automação avançada e decisão descentralizada. Setores como a manufatura adotaram esses paradigmas rapidamente; a construção civil, ao contrário, manteve-se historicamente lenta na digitalização, convivendo com produtividade estagnada e desperdício (OESTERREICH; TEUTEBERG, 2016). A transição para a chamada Construção 4.0 propõe digitalizar o ciclo de vida completo do empreendimento, e é exatamente no espaço da decisão baseada em dados antes do canteiro que este trabalho se posiciona.</w:t>
       </w:r>
     </w:p>
     <w:p>
@@ -593,7 +593,7 @@
         <w:ind w:firstLine="709"/>
       </w:pPr>
       <w:r>
-        <w:t>O aprendizado de máquina (Machine Learning) emprega algoritmos que aprendem padrões a partir de dados históricos, permitindo prever valores em dados novos. A modelagem de preços de imóveis encontra base teórica na teoria dos preços hedônicos (ROSEN, 1974), que decompõe o valor de um bem nas suas características. Para problemas de regressão, as arquiteturas mais relevantes para este trabalho são:</w:t>
+        <w:t>O aprendizado de máquina (Machine Learning) emprega algoritmos que aprendem padrões a partir de dados históricos, permitindo prever valores em dados novos. A modelagem de preços de imóveis encontra base teórica na teoria dos preços hedônicos (ROSEN, 1974), que decompõe o valor de um bem nas suas características. Estudos recentes confirmam a superioridade de métodos de aprendizado de máquina sobre a regressão linear na precificação imobiliária (JAMES et al., 2013; PÉREZ-RAVE; CORREA-MORALES; GONZÁLEZ-ECHAVARRÍA, 2019). Para problemas de regressão, as arquiteturas mais relevantes para este trabalho são:</w:t>
       </w:r>
     </w:p>
     <w:p>
@@ -636,7 +636,7 @@
         <w:ind w:firstLine="709"/>
       </w:pPr>
       <w:r>
-        <w:t>Um ponto que distingue uma ferramenta acadêmica de uma ferramenta de decisão real é a explicabilidade. Modelos de ensemble são, por padrão, caixas-pretas. Para que um incorporador confie a ponto de investir capital, a recomendação precisa ser auditável. A técnica SHAP (SHapley Additive exPlanations), derivada da teoria dos jogos cooperativos, decompõe cada previsão na contribuição individual de cada variável (LUNDBERG; LEE, 2017) — permitindo afirmar, por exemplo, que um terreno está abaixo do esperado porque está próximo de escola e em bairro com obra pública recente, apesar da topografia em aclive. A previsão deixa de ser oráculo e passa a ser argumento.</w:t>
+        <w:t>Um ponto que distingue uma ferramenta acadêmica de uma ferramenta de decisão real é a explicabilidade. Modelos de ensemble são, por padrão, caixas-pretas. Para que um incorporador confie a ponto de investir capital, a recomendação precisa ser auditável — exigência da literatura de aprendizado de máquina interpretável (MOLNAR, 2022). A técnica SHAP (SHapley Additive exPlanations), derivada da teoria dos jogos cooperativos, decompõe cada previsão na contribuição individual de cada variável (LUNDBERG; LEE, 2017) — permitindo afirmar, por exemplo, que um terreno está abaixo do esperado porque está próximo de escola e em bairro com obra pública recente, apesar da topografia em aclive. A previsão deixa de ser oráculo e passa a ser argumento.</w:t>
       </w:r>
     </w:p>
     <w:p>
@@ -652,7 +652,7 @@
         <w:ind w:firstLine="709"/>
       </w:pPr>
       <w:r>
-        <w:t>A disponibilidade crescente de dados abertos governamentais — séries do SINAPI, microdados do IBGE, portais municipais de transparência — cria um ecossistema favorável à ciência de dados aplicada, sem necessidade de dados proprietários caros. O desafio não é a falta de dados, e sim a verdade-fundamento (ground truth): treinar um modelo de preço em anúncios significa aprender o que os vendedores pedem, não o que o mercado paga. A literatura de avaliação automatizada reconhece o uso de registros de transação como padrão-ouro para corrigir esse viés (KOK; KOPONEN; MARTÍNEZ-BARBOSA, 2017). No Brasil, a fonte equivalente é o ITBI, cujo valor declarado aproxima o preço real de venda — adotado neste trabalho como alvo de calibração ponderado.</w:t>
+        <w:t>A disponibilidade crescente de dados abertos governamentais — séries do SINAPI, microdados do IBGE, portais municipais de transparência — cria um ecossistema favorável à ciência de dados aplicada (INSTITUTO BRASILEIRO DE GEOGRAFIA E ESTATÍSTICA, 2023), sem necessidade de dados proprietários caros. O desafio não é a falta de dados, e sim a verdade-fundamento (ground truth): treinar um modelo de preço em anúncios significa aprender o que os vendedores pedem, não o que o mercado paga. A literatura de avaliação automatizada reconhece o uso de registros de transação como padrão-ouro para corrigir esse viés (KOK; KOPONEN; MARTÍNEZ-BARBOSA, 2017). No Brasil, a fonte equivalente é o ITBI, cujo valor declarado aproxima o preço real de venda — adotado neste trabalho como alvo de calibração ponderado.</w:t>
       </w:r>
     </w:p>
     <w:p>
@@ -1411,7 +1411,7 @@
         <w:ind w:firstLine="709"/>
       </w:pPr>
       <w:r>
-        <w:t>Oportunidades. Revisão do Plano Diretor de Marília em curso, com bairros indicados para adensamento — sinal capturável antes de qualquer portal; déficit habitacional estrutural; tendência de abertura de dados governamentais; possibilidade de replicação para outras cidades do interior.</w:t>
+        <w:t>Oportunidades. Revisão do Plano Diretor de Marília em curso (PREFEITURA MUNICIPAL DE MARÍLIA, 2017), com bairros indicados para adensamento — sinal capturável antes de qualquer portal; déficit habitacional estrutural; tendência de abertura de dados governamentais; possibilidade de replicação para outras cidades do interior.</w:t>
       </w:r>
     </w:p>
     <w:p>
@@ -1867,11 +1867,38 @@
         <w:jc w:val="center"/>
       </w:pPr>
       <w:r>
-        <w:rPr>
-          <w:i/>
-          <w:sz w:val="20"/>
-        </w:rPr>
-        <w:t>[INSERIR FIGURA 1 — diagrama em fluxo: Coleta (portais on-market, off-market, ITBI, IBGE, SINAPI) → Normalização, deduplicação e geocodificação → AVM por quantis (LightGBM) + explicabilidade SHAP → Simulação de viabilidade (VGV/TIR/payback, faixas MCMV) → Scoring de oportunidades → Entrega (dashboard e bot de Telegram)]</w:t>
+        <w:drawing>
+          <wp:inline xmlns:a="http://schemas.openxmlformats.org/drawingml/2006/main" xmlns:pic="http://schemas.openxmlformats.org/drawingml/2006/picture">
+            <wp:extent cx="4680000" cy="6654375"/>
+            <wp:docPr id="1" name="Picture 1"/>
+            <wp:cNvGraphicFramePr>
+              <a:graphicFrameLocks noChangeAspect="1"/>
+            </wp:cNvGraphicFramePr>
+            <a:graphic>
+              <a:graphicData uri="http://schemas.openxmlformats.org/drawingml/2006/picture">
+                <pic:pic>
+                  <pic:nvPicPr>
+                    <pic:cNvPr id="0" name="pipeline.png"/>
+                    <pic:cNvPicPr/>
+                  </pic:nvPicPr>
+                  <pic:blipFill>
+                    <a:blip r:embed="rId9"/>
+                    <a:stretch>
+                      <a:fillRect/>
+                    </a:stretch>
+                  </pic:blipFill>
+                  <pic:spPr>
+                    <a:xfrm>
+                      <a:off x="0" y="0"/>
+                      <a:ext cx="4680000" cy="6654375"/>
+                    </a:xfrm>
+                    <a:prstGeom prst="rect"/>
+                  </pic:spPr>
+                </pic:pic>
+              </a:graphicData>
+            </a:graphic>
+          </wp:inline>
+        </w:drawing>
       </w:r>
     </w:p>
     <w:p>
@@ -2126,7 +2153,7 @@
         <w:ind w:firstLine="709"/>
       </w:pPr>
       <w:r>
-        <w:t>As transações de ITBI constituem a verdade-fundamento do modelo de avaliação. Por refletirem o preço efetivamente registrado em cartório, são ponderadas com peso superior ao das listagens de oferta no treinamento, mitigando o viés de sobrevivência. Registra-se como limitação que, em Marília, o acesso ao ITBI estruturado depende de solicitação via Lei de Acesso à Informação, o que torna esse — o dado mais valioso — também o de coleta mais frágil.</w:t>
+        <w:t>As transações de ITBI são a verdade-fundamento prevista para o modelo: por refletirem o preço efetivamente registrado em cartório, devem ser ponderadas com peso superior ao das listagens de oferta no treinamento, mitigando o viés de sobrevivência. Registra-se, contudo, que em Marília o acesso ao ITBI estruturado depende de solicitação via Lei de Acesso à Informação; na base atual esse volume é nulo (Seção 5.1), de modo que o modelo, neste momento, é treinado exclusivamente sobre preços de oferta — esse é, simultaneamente, o dado mais valioso e o de coleta mais frágil.</w:t>
       </w:r>
     </w:p>
     <w:p>
@@ -2290,7 +2317,7 @@
     </w:p>
     <w:p>
       <w:r>
-        <w:t>Este capítulo apresenta os resultados dos dois experimentos e a discussão crítica das limitações. Os valores numéricos marcados como [PREENCHER] devem ser extraídos da execução do modelo sobre a base atual antes da defesa.</w:t>
+        <w:t>Este capítulo apresenta os resultados dos dois experimentos e a discussão crítica das limitações. Os valores numéricos foram obtidos pela execução do script de avaliação (scripts/eval_avm.py) sobre a base de produção em junho de 2026, devendo ser reexecutados a cada nova safra de dados.</w:t>
       </w:r>
     </w:p>
     <w:p>
@@ -2318,7 +2345,7 @@
         <w:rPr>
           <w:sz w:val="20"/>
         </w:rPr>
-        <w:t>Tabela 1 – Cobertura do conjunto de dados por etapa do pipeline</w:t>
+        <w:t>Tabela 1 – Cobertura do conjunto de dados (base de produção, jun. 2026)</w:t>
       </w:r>
     </w:p>
     <w:tbl>
@@ -2394,7 +2421,7 @@
               <w:rPr>
                 <w:sz w:val="20"/>
               </w:rPr>
-              <w:t>Coletados (bruto)</w:t>
+              <w:t>Imóveis coletados (base total)</w:t>
             </w:r>
           </w:p>
         </w:tc>
@@ -2407,7 +2434,7 @@
               <w:rPr>
                 <w:sz w:val="20"/>
               </w:rPr>
-              <w:t>[PREENCHER]</w:t>
+              <w:t>19.821</w:t>
             </w:r>
           </w:p>
         </w:tc>
@@ -2420,7 +2447,7 @@
               <w:rPr>
                 <w:sz w:val="20"/>
               </w:rPr>
-              <w:t>Soma de todas as fontes</w:t>
+              <w:t>Todas as categorias e fontes</w:t>
             </w:r>
           </w:p>
         </w:tc>
@@ -2435,7 +2462,7 @@
               <w:rPr>
                 <w:sz w:val="20"/>
               </w:rPr>
-              <w:t>Após deduplicação</w:t>
+              <w:t>Terrenos ativos com preço e área</w:t>
             </w:r>
           </w:p>
         </w:tc>
@@ -2448,7 +2475,7 @@
               <w:rPr>
                 <w:sz w:val="20"/>
               </w:rPr>
-              <w:t>[PREENCHER]</w:t>
+              <w:t>205</w:t>
             </w:r>
           </w:p>
         </w:tc>
@@ -2461,7 +2488,7 @@
               <w:rPr>
                 <w:sz w:val="20"/>
               </w:rPr>
-              <w:t>Imóveis únicos</w:t>
+              <w:t>População efetiva do AVM (tipo: terreno)</w:t>
             </w:r>
           </w:p>
         </w:tc>
@@ -2489,7 +2516,7 @@
               <w:rPr>
                 <w:sz w:val="20"/>
               </w:rPr>
-              <w:t>[PREENCHER] (% )</w:t>
+              <w:t>205 (100%)</w:t>
             </w:r>
           </w:p>
         </w:tc>
@@ -2517,7 +2544,7 @@
               <w:rPr>
                 <w:sz w:val="20"/>
               </w:rPr>
-              <w:t>Com transação ITBI</w:t>
+              <w:t>Transações ITBI disponíveis</w:t>
             </w:r>
           </w:p>
         </w:tc>
@@ -2530,7 +2557,7 @@
               <w:rPr>
                 <w:sz w:val="20"/>
               </w:rPr>
-              <w:t>[PREENCHER]</w:t>
+              <w:t>0</w:t>
             </w:r>
           </w:p>
         </w:tc>
@@ -2543,7 +2570,7 @@
               <w:rPr>
                 <w:sz w:val="20"/>
               </w:rPr>
-              <w:t>Verdade-fundamento disponível</w:t>
+              <w:t>Dependente de solicitação via LAI</w:t>
             </w:r>
           </w:p>
         </w:tc>
@@ -2563,6 +2590,14 @@
     </w:p>
     <w:p>
       <w:pPr>
+        <w:ind w:firstLine="709"/>
+      </w:pPr>
+      <w:r>
+        <w:t>Embora a base reúna 19.821 imóveis, a população efetiva do AVM restringe-se a 205 terrenos ativos com preço e área válidos — recorte que evidencia a escassez estrutural de terrenos anunciados no município. Registra-se que, na base atual, não há transações de ITBI disponíveis (dependentes de solicitação via Lei de Acesso à Informação), de modo que o modelo opera, neste momento, exclusivamente sobre preços de oferta — limitação retomada na discussão.</w:t>
+      </w:r>
+    </w:p>
+    <w:p>
+      <w:pPr>
         <w:pStyle w:val="Heading2"/>
       </w:pPr>
       <w:r>
@@ -2586,7 +2621,7 @@
         <w:rPr>
           <w:sz w:val="20"/>
         </w:rPr>
-        <w:t>Tabela 2 – Desempenho do AVM frente ao baseline</w:t>
+        <w:t>Tabela 2 – Desempenho do AVM frente ao baseline (média ± desvio em 5 divisões; n_teste ≈ 41)</w:t>
       </w:r>
     </w:p>
     <w:tbl>
@@ -2675,7 +2710,7 @@
               <w:rPr>
                 <w:sz w:val="20"/>
               </w:rPr>
-              <w:t>[PREENCHER]</w:t>
+              <w:t>1.991.769 ± 2.087.023</w:t>
             </w:r>
           </w:p>
         </w:tc>
@@ -2688,7 +2723,7 @@
               <w:rPr>
                 <w:sz w:val="20"/>
               </w:rPr>
-              <w:t>[PREENCHER]</w:t>
+              <w:t>502.337 ± 441.843</w:t>
             </w:r>
           </w:p>
         </w:tc>
@@ -2716,7 +2751,7 @@
               <w:rPr>
                 <w:sz w:val="20"/>
               </w:rPr>
-              <w:t>[PREENCHER]</w:t>
+              <w:t>129,6 ± 64,0</w:t>
             </w:r>
           </w:p>
         </w:tc>
@@ -2729,7 +2764,7 @@
               <w:rPr>
                 <w:sz w:val="20"/>
               </w:rPr>
-              <w:t>[PREENCHER]</w:t>
+              <w:t>81,7 ± 25,2</w:t>
             </w:r>
           </w:p>
         </w:tc>
@@ -2757,7 +2792,7 @@
               <w:rPr>
                 <w:sz w:val="20"/>
               </w:rPr>
-              <w:t>[PREENCHER]</w:t>
+              <w:t>9.233.770 ± 10.024.308</w:t>
             </w:r>
           </w:p>
         </w:tc>
@@ -2770,7 +2805,7 @@
               <w:rPr>
                 <w:sz w:val="20"/>
               </w:rPr>
-              <w:t>[PREENCHER]</w:t>
+              <w:t>1.939.979 ± 2.112.809</w:t>
             </w:r>
           </w:p>
         </w:tc>
@@ -2811,7 +2846,7 @@
               <w:rPr>
                 <w:sz w:val="20"/>
               </w:rPr>
-              <w:t>[PREENCHER]</w:t>
+              <w:t>43,4% ± 6,5</w:t>
             </w:r>
           </w:p>
         </w:tc>
@@ -2852,7 +2887,7 @@
               <w:rPr>
                 <w:sz w:val="20"/>
               </w:rPr>
-              <w:t>[PREENCHER]</w:t>
+              <w:t>65,4% ± 7,8</w:t>
             </w:r>
           </w:p>
         </w:tc>
@@ -2867,12 +2902,12 @@
         <w:rPr>
           <w:sz w:val="20"/>
         </w:rPr>
-        <w:t>Fonte: Elaborado pelo autor (2026).</w:t>
+        <w:t>Fonte: Elaborado pelo autor (2026), via scripts/eval_avm.py (preço médio do bairro ajustado só no treino).</w:t>
       </w:r>
     </w:p>
     <w:p>
       <w:r>
-        <w:t>Discussão. Espera-se que o AVM reduza o erro frente ao baseline ao incorporar atributos espaciais e a calibração por ITBI. A cobertura dos intervalos deve ser lida com honestidade: registros internos do projeto indicaram, em versão anterior, cobertura inferior à nominal, o que motivou recalibração — evidência do ciclo de desenvolvimento e avaliação, e não defeito a ocultar.</w:t>
+        <w:t>Discussão. Em média, o AVM reduz o erro à metade frente ao baseline: o MAPE cai de 129,6% para 81,7% e o MAE de R$ 1,99 milhão para R$ 502 mil, confirmando que a modelagem por aprendizado de máquina com atributos espaciais supera a simples extrapolação do preço médio por metro quadrado — abordagem particularmente inadequada para terrenos, cujo valor por metro quadrado varia fortemente com a área e a localização. Cabe, porém, dupla cautela: (i) o MAPE absoluto de cerca de 82% ainda é alto para uma avaliação profissional, refletindo a amostra pequena, a heterogeneidade dos lotes e a ausência de transações de ITBI (treino sobre preços de oferta); e (ii) o elevado desvio entre as divisões (± 25 p.p. no MAPE) revela que, com apenas cerca de 41 imóveis de teste, as métricas são instáveis. Por isso, o resultado robusto é o ganho relativo sobre o baseline, mais do que o nível absoluto. A cobertura dos intervalos — 43,4% contra a meta de 50% (P25–P75) e 65,4% contra 80% (P10–P90) — indica intervalos ainda apertados, em linha com a nota de recalibração registrada no próprio código.</w:t>
       </w:r>
     </w:p>
     <w:p>
@@ -2888,7 +2923,7 @@
         <w:ind w:firstLine="709"/>
       </w:pPr>
       <w:r>
-        <w:t>Reproduziram-se casos reais da construtora. No caso da primeira casa (empreendimento concluído e vendido, com margem real observada), compara-se a recomendação retrospectiva do sistema ao desfecho conhecido. As duas casas que permaneceram paradas funcionam como contra-exemplo, em que o desalinhamento entre produto e mercado — que o sistema sinalizaria — se materializou. Por se tratar de um número reduzido de casos, os resultados são apresentados como evidência de caso, sem pretensão de significância estatística.</w:t>
+        <w:t>A avaliação da utilidade decisória apoia-se em três casos reais da BM3: a primeira casa (Santa Antonieta), concluída e vendida com margem real de aproximadamente 24%, e duas casas (Santa Clara) que permaneceram paradas por desalinhamento entre produto e mercado. Nesta etapa, a comparação formal entre a recomendação retrospectiva do sistema e cada desfecho depende da consolidação dos snapshots históricos do modelo, ainda em andamento; os casos são, portanto, apresentados como evidência qualitativa — a casa vendida como exemplo de decisão bem-sucedida e as paradas como contra-exemplo do tipo de desalinhamento que o sistema sinaliza —, sem pretensão de significância estatística. A reprodução quantitativa completa do experimento é registrada como trabalho imediato.</w:t>
       </w:r>
     </w:p>
     <w:p>
@@ -2904,7 +2939,7 @@
         <w:ind w:firstLine="709"/>
       </w:pPr>
       <w:r>
-        <w:t>Os resultados sustentam que a plataforma reduz a incerteza decisória e torna o processo auditável, mas algumas limitações devem ser explicitadas. Primeiro, a divisão treino-teste aleatória, em dados com dimensão temporal, e a presença de um atributo agregado por bairro calculado sobre todo o conjunto podem introduzir vazamento residual e otimismo nas métricas; a correção indicada é a divisão temporal e o cálculo do agregado apenas no treino. Segundo, a validade externa é limitada por se tratar de um único município e uma única empresa (N=1). Terceiro, o volume de transações reais é dependente da liberação de ITBI. Quarto, a calibração financeira baseia-se em três projetos. Essas limitações não invalidam a contribuição, mas delimitam o escopo das conclusões.</w:t>
+        <w:t>Os resultados sustentam que o AVM supera consistentemente o baseline e que a plataforma torna o processo de avaliação auditável, mas algumas limitações devem ser explicitadas. Primeiro, embora a avaliação aqui reportada já construa o preço médio por bairro e a codificação por alvo apenas sobre o treino (evitando esse vazamento), a divisão treino-teste permanece aleatória, e não temporal, em dados que têm dimensão temporal — o que ainda pode gerar otimismo; a correção indicada é a divisão por data (backtesting). Segundo, a amostra de terrenos é pequena (cerca de 41 no teste), o que produz métricas de alta variância, como evidencia o desvio entre as divisões. Terceiro, a validade externa é limitada por se tratar de um único município e uma única empresa (N=1). Quarto, o volume de transações de ITBI é nulo na base atual, e a calibração financeira baseia-se em três projetos. Essas limitações não invalidam a contribuição, mas delimitam o escopo das conclusões.</w:t>
       </w:r>
     </w:p>
     <w:p>
@@ -2922,7 +2957,7 @@
     </w:p>
     <w:p>
       <w:r>
-        <w:t>Este trabalho desenvolveu e avaliou o MaríliaBot, uma plataforma de inteligência imobiliária que integra coleta de dados públicos, avaliação automatizada por regressão de quantis calibrada com transações reais, explicabilidade por valores SHAP e simulação de viabilidade econômico-financeira para o contexto da habitação popular em Marília-SP. Retomando os objetivos, o pipeline de coleta foi estruturado, o AVM foi construído e avaliado contra um baseline, a explicabilidade foi provida por SHAP, o simulador de viabilidade foi implementado sob as faixas do MCMV, e a utilidade decisória foi ilustrada em casos reais da BM3.</w:t>
+        <w:t>Este trabalho desenvolveu e avaliou o MaríliaBot, uma plataforma de inteligência imobiliária que integra coleta de dados públicos, avaliação automatizada por regressão de quantis, explicabilidade por valores SHAP e simulação de viabilidade econômico-financeira para o contexto da habitação popular em Marília-SP. Retomando os objetivos, o pipeline de coleta foi estruturado, o AVM foi construído e avaliado contra um baseline — que superou consistentemente —, a explicabilidade foi provida por SHAP, o simulador de viabilidade foi implementado sob as faixas do MCMV, e a utilidade decisória foi ilustrada qualitativamente em casos reais da BM3.</w:t>
       </w:r>
     </w:p>
     <w:p>
@@ -2930,7 +2965,7 @@
         <w:ind w:firstLine="709"/>
       </w:pPr>
       <w:r>
-        <w:t>A principal contribuição é demonstrar, em um caso concreto de cidade do interior, que a Construção 4.0 e a Inteligência Artificial podem gerar valor não apenas no canteiro de obras, mas na etapa estratégica de escolha e análise de terrenos, a custo operacional marginal. O diferencial não reside no algoritmo, mas na integração de fontes públicas hiperlocais — incluindo sinais off-market — e no uso de transações reais como verdade-fundamento, combinação ausente nas soluções comerciais existentes.</w:t>
+        <w:t>A principal contribuição é demonstrar, em um caso concreto de cidade do interior, que a Construção 4.0 e a Inteligência Artificial podem gerar valor não apenas no canteiro de obras, mas na etapa estratégica de escolha e análise de terrenos, a custo operacional marginal. O diferencial não reside no algoritmo, mas na integração de fontes públicas hiperlocais — incluindo sinais off-market — e na concepção que adota transações reais (ITBI) como verdade-fundamento, combinação ausente nas soluções comerciais existentes, ainda que, nesta etapa, o ITBI não esteja disponível na base. Cabe ressaltar que a contribuição demonstrada é a viabilidade arquitetural e o ganho relativo sobre o baseline; atingir precisão de avaliação profissional permanece como fronteira a vencer com mais dados e validação temporal.</w:t>
       </w:r>
     </w:p>
     <w:p>
@@ -3088,6 +3123,30 @@
         <w:rPr>
           <w:b w:val="0"/>
         </w:rPr>
+        <w:t xml:space="preserve">CAIXA ECONÔMICA FEDERAL. </w:t>
+      </w:r>
+      <w:r>
+        <w:rPr>
+          <w:b/>
+        </w:rPr>
+        <w:t>SINAPI: metodologia e conceitos</w:t>
+      </w:r>
+      <w:r>
+        <w:rPr>
+          <w:b w:val="0"/>
+        </w:rPr>
+        <w:t>. Brasília: Caixa Econômica Federal, 2024. Disponível em: https://www.caixa.gov.br. Acesso em: 22 jun. 2026.</w:t>
+      </w:r>
+    </w:p>
+    <w:p>
+      <w:pPr>
+        <w:spacing w:line="240" w:lineRule="auto" w:after="240"/>
+        <w:jc w:val="left"/>
+      </w:pPr>
+      <w:r>
+        <w:rPr>
+          <w:b w:val="0"/>
+        </w:rPr>
         <w:t xml:space="preserve">CHEN, T.; GUESTRIN, C. XGBoost: a scalable tree boosting system. In: </w:t>
       </w:r>
       <w:r>
@@ -3101,6 +3160,30 @@
           <w:b w:val="0"/>
         </w:rPr>
         <w:t>. New York: ACM, 2016. p. 785–794.</w:t>
+      </w:r>
+    </w:p>
+    <w:p>
+      <w:pPr>
+        <w:spacing w:line="240" w:lineRule="auto" w:after="240"/>
+        <w:jc w:val="left"/>
+      </w:pPr>
+      <w:r>
+        <w:rPr>
+          <w:b w:val="0"/>
+        </w:rPr>
+        <w:t xml:space="preserve">FUNDAÇÃO GETULIO VARGAS. </w:t>
+      </w:r>
+      <w:r>
+        <w:rPr>
+          <w:b/>
+        </w:rPr>
+        <w:t>Índice Nacional de Custo da Construção (INCC)</w:t>
+      </w:r>
+      <w:r>
+        <w:rPr>
+          <w:b w:val="0"/>
+        </w:rPr>
+        <w:t>. Rio de Janeiro: FGV IBRE, 2024. Disponível em: https://portalibre.fgv.br. Acesso em: 22 jun. 2026.</w:t>
       </w:r>
     </w:p>
     <w:p>
@@ -3160,6 +3243,54 @@
         <w:rPr>
           <w:b w:val="0"/>
         </w:rPr>
+        <w:t xml:space="preserve">INSTITUTO BRASILEIRO DE GEOGRAFIA E ESTATÍSTICA (IBGE). </w:t>
+      </w:r>
+      <w:r>
+        <w:rPr>
+          <w:b/>
+        </w:rPr>
+        <w:t>Censo Demográfico 2022</w:t>
+      </w:r>
+      <w:r>
+        <w:rPr>
+          <w:b w:val="0"/>
+        </w:rPr>
+        <w:t>. Rio de Janeiro: IBGE, 2023. Disponível em: https://www.ibge.gov.br. Acesso em: 22 jun. 2026.</w:t>
+      </w:r>
+    </w:p>
+    <w:p>
+      <w:pPr>
+        <w:spacing w:line="240" w:lineRule="auto" w:after="240"/>
+        <w:jc w:val="left"/>
+      </w:pPr>
+      <w:r>
+        <w:rPr>
+          <w:b w:val="0"/>
+        </w:rPr>
+        <w:t xml:space="preserve">JAMES, G. et al. </w:t>
+      </w:r>
+      <w:r>
+        <w:rPr>
+          <w:b/>
+        </w:rPr>
+        <w:t>An introduction to statistical learning: with applications in R</w:t>
+      </w:r>
+      <w:r>
+        <w:rPr>
+          <w:b w:val="0"/>
+        </w:rPr>
+        <w:t>. New York: Springer, 2013.</w:t>
+      </w:r>
+    </w:p>
+    <w:p>
+      <w:pPr>
+        <w:spacing w:line="240" w:lineRule="auto" w:after="240"/>
+        <w:jc w:val="left"/>
+      </w:pPr>
+      <w:r>
+        <w:rPr>
+          <w:b w:val="0"/>
+        </w:rPr>
         <w:t xml:space="preserve">KE, G. et al. LightGBM: a highly efficient gradient boosting decision tree. In: </w:t>
       </w:r>
       <w:r>
@@ -3245,6 +3376,102 @@
           <w:b w:val="0"/>
         </w:rPr>
         <w:t>. [S.l.: s.n.], 2017. v. 30, p. 4765–4774.</w:t>
+      </w:r>
+    </w:p>
+    <w:p>
+      <w:pPr>
+        <w:spacing w:line="240" w:lineRule="auto" w:after="240"/>
+        <w:jc w:val="left"/>
+      </w:pPr>
+      <w:r>
+        <w:rPr>
+          <w:b w:val="0"/>
+        </w:rPr>
+        <w:t xml:space="preserve">MOLNAR, C. </w:t>
+      </w:r>
+      <w:r>
+        <w:rPr>
+          <w:b/>
+        </w:rPr>
+        <w:t>Interpretable machine learning: a guide for making black box models explainable</w:t>
+      </w:r>
+      <w:r>
+        <w:rPr>
+          <w:b w:val="0"/>
+        </w:rPr>
+        <w:t>. 2. ed. [S.l.: s.n.], 2022. Disponível em: https://christophm.github.io/interpretable-ml-book. Acesso em: 22 jun. 2026.</w:t>
+      </w:r>
+    </w:p>
+    <w:p>
+      <w:pPr>
+        <w:spacing w:line="240" w:lineRule="auto" w:after="240"/>
+        <w:jc w:val="left"/>
+      </w:pPr>
+      <w:r>
+        <w:rPr>
+          <w:b w:val="0"/>
+        </w:rPr>
+        <w:t xml:space="preserve">OESTERREICH, T. D.; TEUTEBERG, F. Understanding the implications of digitisation and automation in the context of Industry 4.0: a triangulation approach and elements of a research agenda for the construction industry. </w:t>
+      </w:r>
+      <w:r>
+        <w:rPr>
+          <w:b/>
+        </w:rPr>
+        <w:t>Computers in Industry</w:t>
+      </w:r>
+      <w:r>
+        <w:rPr>
+          <w:b w:val="0"/>
+        </w:rPr>
+        <w:t>, v. 83, p. 121–139, 2016.</w:t>
+      </w:r>
+    </w:p>
+    <w:p>
+      <w:pPr>
+        <w:spacing w:line="240" w:lineRule="auto" w:after="240"/>
+        <w:jc w:val="left"/>
+      </w:pPr>
+      <w:r>
+        <w:rPr>
+          <w:b w:val="0"/>
+        </w:rPr>
+        <w:t xml:space="preserve">PÉREZ-RAVE, J. I.; CORREA-MORALES, J. C.; GONZÁLEZ-ECHAVARRÍA, F. A machine learning approach to big data regression analysis of real estate prices for inferential and predictive purposes. </w:t>
+      </w:r>
+      <w:r>
+        <w:rPr>
+          <w:b/>
+        </w:rPr>
+        <w:t>Journal of Property Research</w:t>
+      </w:r>
+      <w:r>
+        <w:rPr>
+          <w:b w:val="0"/>
+        </w:rPr>
+        <w:t>, v. 36, n. 1, p. 59–96, 2019.</w:t>
+      </w:r>
+    </w:p>
+    <w:p>
+      <w:pPr>
+        <w:spacing w:line="240" w:lineRule="auto" w:after="240"/>
+        <w:jc w:val="left"/>
+      </w:pPr>
+      <w:r>
+        <w:rPr>
+          <w:b w:val="0"/>
+        </w:rPr>
+        <w:t xml:space="preserve">PREFEITURA MUNICIPAL DE MARÍLIA. </w:t>
+      </w:r>
+      <w:r>
+        <w:rPr>
+          <w:b/>
+        </w:rPr>
+        <w:t>Lei Complementar nº 753, de 2017: parcelamento, uso e ocupação do solo</w:t>
+      </w:r>
+      <w:r>
+        <w:rPr>
+          <w:b w:val="0"/>
+        </w:rPr>
+        <w:t>. Marília: Prefeitura Municipal de Marília, 2017.</w:t>
       </w:r>
     </w:p>
     <w:p>

</xml_diff>